<commit_message>
Make the project the Kaggle NYC taxi mini-project only: remove experiment references, rebuild notebook and reports
</commit_message>
<xml_diff>
--- a/reports/technical_report.docx
+++ b/reports/technical_report.docx
@@ -106,7 +106,7 @@
         <w:spacing w:after="120" w:line="276"/>
       </w:pPr>
       <w:r>
-        <w:t xml:space="preserve">Possible uses are estimated time of arrival (ETA) and fare estimation, driver dispatch planning and urban mobility analysis. The work follows the six-stage mini-project workflow and covers Experiment 3.4, Prediction and Performance Analysis using a Trained Machine Learning Model.</w:t>
+        <w:t xml:space="preserve">Possible uses are estimated time of arrival (ETA) and fare estimation, driver dispatch planning and urban mobility analysis. The work follows the six-stage mini-project workflow.</w:t>
       </w:r>
     </w:p>
     <w:p>
@@ -7372,7 +7372,7 @@
         <w:pStyle w:val="Heading2"/>
       </w:pPr>
       <w:r>
-        <w:t xml:space="preserve">Actual versus predicted values (Experiment 3.4)</w:t>
+        <w:t xml:space="preserve">Actual versus predicted values</w:t>
       </w:r>
     </w:p>
     <w:p>

</xml_diff>